<commit_message>
perfil modificado e dashboards
</commit_message>
<xml_diff>
--- a/docs/ProjectoFimCurso.docx
+++ b/docs/ProjectoFimCurso.docx
@@ -6,6 +6,7 @@
       <w:pPr>
         <w:jc w:val="center"/>
       </w:pPr>
+      <w:bookmarkStart w:id="0" w:name="_Hlk219917869"/>
       <w:r>
         <w:rPr>
           <w:rFonts w:ascii="Times New Roman" w:hAnsi="Times New Roman" w:cs="Times New Roman"/>
@@ -34,7 +35,7 @@
                     </pic:cNvPicPr>
                   </pic:nvPicPr>
                   <pic:blipFill>
-                    <a:blip r:embed="rId6">
+                    <a:blip r:embed="rId8">
                       <a:extLst>
                         <a:ext uri="{28A0092B-C50C-407E-A947-70E740481C1C}">
                           <a14:useLocalDpi xmlns:a14="http://schemas.microsoft.com/office/drawing/2010/main" val="0"/>
@@ -102,14 +103,6 @@
       </w:r>
     </w:p>
     <w:p/>
-    <w:p/>
-    <w:p>
-      <w:pPr>
-        <w:rPr>
-          <w:u w:val="single"/>
-        </w:rPr>
-      </w:pPr>
-    </w:p>
     <w:p>
       <w:pPr>
         <w:jc w:val="center"/>
@@ -123,23 +116,47 @@
           <w:sz w:val="32"/>
           <w:szCs w:val="32"/>
         </w:rPr>
-        <w:t xml:space="preserve">SISTEMA DE GESTÃO DE DECLARAÇÕES </w:t>
-      </w:r>
-      <w:r>
+        <w:t>PROVA DE APTIDÃO PROFISSIONAL (P.A.P)</w:t>
+      </w:r>
+    </w:p>
+    <w:p>
+      <w:pPr>
+        <w:rPr>
+          <w:u w:val="single"/>
+        </w:rPr>
+      </w:pPr>
+    </w:p>
+    <w:p>
+      <w:pPr>
+        <w:jc w:val="center"/>
         <w:rPr>
           <w:sz w:val="32"/>
           <w:szCs w:val="32"/>
         </w:rPr>
-        <w:t>ESCOLARES PARA A</w:t>
-      </w:r>
+      </w:pPr>
       <w:r>
         <w:rPr>
           <w:sz w:val="32"/>
           <w:szCs w:val="32"/>
         </w:rPr>
+        <w:t xml:space="preserve">SISTEMA DE GESTÃO DE DECLARAÇÕES </w:t>
+      </w:r>
+      <w:r>
+        <w:rPr>
+          <w:sz w:val="32"/>
+          <w:szCs w:val="32"/>
+        </w:rPr>
+        <w:t>ESCOLARES PARA A</w:t>
+      </w:r>
+      <w:r>
+        <w:rPr>
+          <w:sz w:val="32"/>
+          <w:szCs w:val="32"/>
+        </w:rPr>
         <w:t xml:space="preserve"> SECRETÁRIA DO INSTITUTO POLITÉCNICO DO MAIOMBE-3050</w:t>
       </w:r>
     </w:p>
+    <w:bookmarkEnd w:id="0"/>
     <w:p>
       <w:pPr>
         <w:jc w:val="center"/>
@@ -158,15 +175,21 @@
     <w:p/>
     <w:p/>
     <w:p/>
-    <w:p/>
-    <w:p/>
     <w:p>
       <w:pPr>
         <w:jc w:val="center"/>
       </w:pPr>
-      <w:r>
-        <w:t>ICOLO E BENGO 2025/2026</w:t>
-      </w:r>
+      <w:bookmarkStart w:id="1" w:name="_Hlk219917883"/>
+      <w:r>
+        <w:t>ICOLO E BENGO</w:t>
+      </w:r>
+      <w:r>
+        <w:t>,</w:t>
+      </w:r>
+      <w:r>
+        <w:t xml:space="preserve"> 2025/2026</w:t>
+      </w:r>
+      <w:bookmarkEnd w:id="1"/>
       <w:r>
         <w:br w:type="page"/>
       </w:r>
@@ -175,6 +198,7 @@
       <w:pPr>
         <w:jc w:val="center"/>
       </w:pPr>
+      <w:bookmarkStart w:id="2" w:name="_Hlk219917911"/>
       <w:r>
         <w:rPr>
           <w:noProof/>
@@ -197,7 +221,7 @@
                     <pic:cNvPicPr/>
                   </pic:nvPicPr>
                   <pic:blipFill>
-                    <a:blip r:embed="rId7">
+                    <a:blip r:embed="rId9">
                       <a:extLst>
                         <a:ext uri="{28A0092B-C50C-407E-A947-70E740481C1C}">
                           <a14:useLocalDpi xmlns:a14="http://schemas.microsoft.com/office/drawing/2010/main" val="0"/>
@@ -254,102 +278,837 @@
         <w:t>PROVA DE APTIDÃO PROFISSIONAL (P.A.P)</w:t>
       </w:r>
     </w:p>
+    <w:p>
+      <w:pPr>
+        <w:jc w:val="center"/>
+        <w:rPr>
+          <w:sz w:val="22"/>
+          <w:szCs w:val="20"/>
+        </w:rPr>
+      </w:pPr>
+    </w:p>
+    <w:p>
+      <w:pPr>
+        <w:jc w:val="center"/>
+        <w:rPr>
+          <w:sz w:val="32"/>
+          <w:szCs w:val="32"/>
+        </w:rPr>
+      </w:pPr>
+      <w:r>
+        <w:rPr>
+          <w:sz w:val="32"/>
+          <w:szCs w:val="32"/>
+        </w:rPr>
+        <w:t xml:space="preserve">SISTEMA DE GESTÃO DE DECLARAÇÕES </w:t>
+      </w:r>
+      <w:r>
+        <w:rPr>
+          <w:sz w:val="32"/>
+          <w:szCs w:val="32"/>
+        </w:rPr>
+        <w:t xml:space="preserve">ESCOLARES </w:t>
+      </w:r>
+      <w:r>
+        <w:rPr>
+          <w:sz w:val="32"/>
+          <w:szCs w:val="32"/>
+        </w:rPr>
+        <w:t xml:space="preserve">PARA </w:t>
+      </w:r>
+      <w:r>
+        <w:rPr>
+          <w:sz w:val="32"/>
+          <w:szCs w:val="32"/>
+        </w:rPr>
+        <w:t xml:space="preserve"> A</w:t>
+      </w:r>
+      <w:r>
+        <w:rPr>
+          <w:sz w:val="32"/>
+          <w:szCs w:val="32"/>
+        </w:rPr>
+        <w:t xml:space="preserve"> SECRETÁRIA DO INSTITUTO POLITÉCNICO DO MAIOMBE-3050</w:t>
+      </w:r>
+    </w:p>
+    <w:p>
+      <w:pPr>
+        <w:spacing w:before="0" w:after="0"/>
+        <w:jc w:val="center"/>
+        <w:rPr>
+          <w:b/>
+          <w:bCs/>
+          <w:szCs w:val="24"/>
+        </w:rPr>
+      </w:pPr>
+      <w:r>
+        <w:rPr>
+          <w:b/>
+          <w:bCs/>
+          <w:szCs w:val="24"/>
+        </w:rPr>
+        <w:t xml:space="preserve">        </w:t>
+      </w:r>
+      <w:r>
+        <w:rPr>
+          <w:b/>
+          <w:bCs/>
+          <w:szCs w:val="24"/>
+        </w:rPr>
+        <w:t>INTEGRANTES DO GRUPO</w:t>
+      </w:r>
+      <w:r>
+        <w:rPr>
+          <w:b/>
+          <w:bCs/>
+          <w:szCs w:val="24"/>
+        </w:rPr>
+        <w:t>:</w:t>
+      </w:r>
+    </w:p>
+    <w:p>
+      <w:pPr>
+        <w:pStyle w:val="ListParagraph"/>
+        <w:numPr>
+          <w:ilvl w:val="0"/>
+          <w:numId w:val="3"/>
+        </w:numPr>
+        <w:spacing w:before="0" w:after="0"/>
+        <w:jc w:val="center"/>
+        <w:rPr>
+          <w:b/>
+          <w:bCs/>
+          <w:szCs w:val="24"/>
+        </w:rPr>
+      </w:pPr>
+      <w:r>
+        <w:rPr>
+          <w:b/>
+          <w:bCs/>
+          <w:szCs w:val="24"/>
+        </w:rPr>
+        <w:t>Antonio Valente</w:t>
+      </w:r>
+    </w:p>
+    <w:p>
+      <w:pPr>
+        <w:pStyle w:val="ListParagraph"/>
+        <w:numPr>
+          <w:ilvl w:val="0"/>
+          <w:numId w:val="3"/>
+        </w:numPr>
+        <w:spacing w:before="0" w:after="0"/>
+        <w:jc w:val="center"/>
+        <w:rPr>
+          <w:b/>
+          <w:bCs/>
+          <w:szCs w:val="24"/>
+        </w:rPr>
+      </w:pPr>
+      <w:r>
+        <w:rPr>
+          <w:b/>
+          <w:bCs/>
+          <w:szCs w:val="24"/>
+        </w:rPr>
+        <w:t>Gabriel Pedro Aurélio</w:t>
+      </w:r>
+    </w:p>
+    <w:p>
+      <w:pPr>
+        <w:pStyle w:val="ListParagraph"/>
+        <w:numPr>
+          <w:ilvl w:val="0"/>
+          <w:numId w:val="3"/>
+        </w:numPr>
+        <w:spacing w:before="0" w:after="0"/>
+        <w:jc w:val="center"/>
+        <w:rPr>
+          <w:b/>
+          <w:bCs/>
+          <w:szCs w:val="24"/>
+        </w:rPr>
+      </w:pPr>
+      <w:r>
+        <w:rPr>
+          <w:b/>
+          <w:bCs/>
+          <w:szCs w:val="24"/>
+        </w:rPr>
+        <w:t>Helena Setas da Cruz</w:t>
+      </w:r>
+    </w:p>
+    <w:p>
+      <w:pPr>
+        <w:pStyle w:val="ListParagraph"/>
+        <w:numPr>
+          <w:ilvl w:val="0"/>
+          <w:numId w:val="3"/>
+        </w:numPr>
+        <w:spacing w:before="0" w:after="0"/>
+        <w:jc w:val="center"/>
+        <w:rPr>
+          <w:b/>
+          <w:bCs/>
+          <w:szCs w:val="24"/>
+        </w:rPr>
+      </w:pPr>
+      <w:r>
+        <w:rPr>
+          <w:b/>
+          <w:bCs/>
+          <w:szCs w:val="24"/>
+        </w:rPr>
+        <w:t>Raúl Paulo Neto</w:t>
+      </w:r>
+    </w:p>
+    <w:p>
+      <w:pPr>
+        <w:pStyle w:val="ListParagraph"/>
+        <w:numPr>
+          <w:ilvl w:val="0"/>
+          <w:numId w:val="3"/>
+        </w:numPr>
+        <w:spacing w:before="0" w:after="0"/>
+        <w:jc w:val="center"/>
+        <w:rPr>
+          <w:b/>
+          <w:bCs/>
+          <w:szCs w:val="24"/>
+        </w:rPr>
+      </w:pPr>
+      <w:r>
+        <w:rPr>
+          <w:b/>
+          <w:bCs/>
+          <w:szCs w:val="24"/>
+        </w:rPr>
+        <w:t>Shelcia Domingos Manuel</w:t>
+      </w:r>
+    </w:p>
+    <w:p>
+      <w:pPr>
+        <w:pStyle w:val="ListParagraph"/>
+        <w:ind w:left="1429" w:firstLine="0"/>
+        <w:rPr>
+          <w:sz w:val="32"/>
+          <w:szCs w:val="32"/>
+        </w:rPr>
+      </w:pPr>
+      <w:r>
+        <w:rPr>
+          <w:rFonts w:eastAsia="Times New Roman" w:cs="Arial"/>
+          <w:b/>
+          <w:bCs/>
+          <w:noProof/>
+          <w:szCs w:val="24"/>
+          <w:lang w:eastAsia="pt-PT"/>
+        </w:rPr>
+        <mc:AlternateContent>
+          <mc:Choice Requires="wps">
+            <w:drawing>
+              <wp:anchor distT="0" distB="0" distL="114300" distR="114300" simplePos="0" relativeHeight="251659264" behindDoc="0" locked="0" layoutInCell="1" allowOverlap="1" wp14:anchorId="462EB666" wp14:editId="026539CC">
+                <wp:simplePos x="0" y="0"/>
+                <wp:positionH relativeFrom="column">
+                  <wp:posOffset>1529080</wp:posOffset>
+                </wp:positionH>
+                <wp:positionV relativeFrom="paragraph">
+                  <wp:posOffset>432435</wp:posOffset>
+                </wp:positionV>
+                <wp:extent cx="4272915" cy="885825"/>
+                <wp:effectExtent l="0" t="0" r="0" b="9525"/>
+                <wp:wrapTopAndBottom/>
+                <wp:docPr id="3" name="Retângulo 3"/>
+                <wp:cNvGraphicFramePr/>
+                <a:graphic xmlns:a="http://schemas.openxmlformats.org/drawingml/2006/main">
+                  <a:graphicData uri="http://schemas.microsoft.com/office/word/2010/wordprocessingShape">
+                    <wps:wsp>
+                      <wps:cNvSpPr/>
+                      <wps:spPr>
+                        <a:xfrm>
+                          <a:off x="0" y="0"/>
+                          <a:ext cx="4272915" cy="885825"/>
+                        </a:xfrm>
+                        <a:prstGeom prst="rect">
+                          <a:avLst/>
+                        </a:prstGeom>
+                        <a:noFill/>
+                        <a:ln>
+                          <a:noFill/>
+                        </a:ln>
+                      </wps:spPr>
+                      <wps:style>
+                        <a:lnRef idx="0">
+                          <a:scrgbClr r="0" g="0" b="0"/>
+                        </a:lnRef>
+                        <a:fillRef idx="0">
+                          <a:scrgbClr r="0" g="0" b="0"/>
+                        </a:fillRef>
+                        <a:effectRef idx="0">
+                          <a:scrgbClr r="0" g="0" b="0"/>
+                        </a:effectRef>
+                        <a:fontRef idx="minor">
+                          <a:schemeClr val="dk1"/>
+                        </a:fontRef>
+                      </wps:style>
+                      <wps:txbx>
+                        <w:txbxContent>
+                          <w:p>
+                            <w:pPr>
+                              <w:ind w:firstLine="0"/>
+                              <w:jc w:val="left"/>
+                              <w:rPr>
+                                <w:rFonts w:cs="Arial"/>
+                                <w:bCs/>
+                                <w:sz w:val="20"/>
+                                <w:szCs w:val="20"/>
+                              </w:rPr>
+                            </w:pPr>
+                            <w:r>
+                              <w:rPr>
+                                <w:rFonts w:cs="Arial"/>
+                                <w:bCs/>
+                                <w:sz w:val="20"/>
+                                <w:szCs w:val="20"/>
+                              </w:rPr>
+                              <w:t>Prova de aptidão profissional apresentada ao Instituto Politécnico Maiombe como um dos requisito para a obtenção do grau de Técnico Médio de Informática, Sob orientação do Prof. Ramos Panzo</w:t>
+                            </w:r>
+                            <w:r>
+                              <w:rPr>
+                                <w:rFonts w:eastAsia="Times New Roman" w:cs="Arial"/>
+                                <w:bCs/>
+                                <w:sz w:val="20"/>
+                                <w:szCs w:val="20"/>
+                                <w:lang w:eastAsia="pt-PT"/>
+                              </w:rPr>
+                              <w:br/>
+                            </w:r>
+                            <w:r>
+                              <w:rPr>
+                                <w:rFonts w:eastAsia="Times New Roman" w:cs="Arial"/>
+                                <w:bCs/>
+                                <w:sz w:val="20"/>
+                                <w:szCs w:val="20"/>
+                                <w:lang w:eastAsia="pt-PT"/>
+                              </w:rPr>
+                              <w:br/>
+                            </w:r>
+                          </w:p>
+                        </w:txbxContent>
+                      </wps:txbx>
+                      <wps:bodyPr rot="0" spcFirstLastPara="0" vertOverflow="overflow" horzOverflow="overflow" vert="horz" wrap="square" lIns="91440" tIns="45720" rIns="91440" bIns="45720" numCol="1" spcCol="0" rtlCol="0" fromWordArt="0" anchor="ctr" anchorCtr="0" forceAA="0" compatLnSpc="1">
+                        <a:prstTxWarp prst="textNoShape">
+                          <a:avLst/>
+                        </a:prstTxWarp>
+                        <a:noAutofit/>
+                      </wps:bodyPr>
+                    </wps:wsp>
+                  </a:graphicData>
+                </a:graphic>
+                <wp14:sizeRelH relativeFrom="margin">
+                  <wp14:pctWidth>0</wp14:pctWidth>
+                </wp14:sizeRelH>
+                <wp14:sizeRelV relativeFrom="margin">
+                  <wp14:pctHeight>0</wp14:pctHeight>
+                </wp14:sizeRelV>
+              </wp:anchor>
+            </w:drawing>
+          </mc:Choice>
+          <mc:Fallback>
+            <w:pict>
+              <v:rect w14:anchorId="462EB666" id="Retângulo 3" o:spid="_x0000_s1026" style="position:absolute;left:0;text-align:left;margin-left:120.4pt;margin-top:34.05pt;width:336.45pt;height:69.75pt;z-index:251659264;visibility:visible;mso-wrap-style:square;mso-width-percent:0;mso-height-percent:0;mso-wrap-distance-left:9pt;mso-wrap-distance-top:0;mso-wrap-distance-right:9pt;mso-wrap-distance-bottom:0;mso-position-horizontal:absolute;mso-position-horizontal-relative:text;mso-position-vertical:absolute;mso-position-vertical-relative:text;mso-width-percent:0;mso-height-percent:0;mso-width-relative:margin;mso-height-relative:margin;v-text-anchor:middle" o:gfxdata="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" filled="f" stroked="f">
+                <v:textbox>
+                  <w:txbxContent>
+                    <w:p>
+                      <w:pPr>
+                        <w:ind w:firstLine="0"/>
+                        <w:jc w:val="left"/>
+                        <w:rPr>
+                          <w:rFonts w:cs="Arial"/>
+                          <w:bCs/>
+                          <w:sz w:val="20"/>
+                          <w:szCs w:val="20"/>
+                        </w:rPr>
+                      </w:pPr>
+                      <w:r>
+                        <w:rPr>
+                          <w:rFonts w:cs="Arial"/>
+                          <w:bCs/>
+                          <w:sz w:val="20"/>
+                          <w:szCs w:val="20"/>
+                        </w:rPr>
+                        <w:t>Prova de aptidão profissional apresentada ao Instituto Politécnico Maiombe como um dos requisito para a obtenção do grau de Técnico Médio de Informática, Sob orientação do Prof. Ramos Panzo</w:t>
+                      </w:r>
+                      <w:r>
+                        <w:rPr>
+                          <w:rFonts w:eastAsia="Times New Roman" w:cs="Arial"/>
+                          <w:bCs/>
+                          <w:sz w:val="20"/>
+                          <w:szCs w:val="20"/>
+                          <w:lang w:eastAsia="pt-PT"/>
+                        </w:rPr>
+                        <w:br/>
+                      </w:r>
+                      <w:r>
+                        <w:rPr>
+                          <w:rFonts w:eastAsia="Times New Roman" w:cs="Arial"/>
+                          <w:bCs/>
+                          <w:sz w:val="20"/>
+                          <w:szCs w:val="20"/>
+                          <w:lang w:eastAsia="pt-PT"/>
+                        </w:rPr>
+                        <w:br/>
+                      </w:r>
+                    </w:p>
+                  </w:txbxContent>
+                </v:textbox>
+                <w10:wrap type="topAndBottom"/>
+              </v:rect>
+            </w:pict>
+          </mc:Fallback>
+        </mc:AlternateContent>
+      </w:r>
+    </w:p>
+    <w:p>
+      <w:pPr>
+        <w:ind w:firstLine="0"/>
+      </w:pPr>
+    </w:p>
+    <w:p>
+      <w:pPr>
+        <w:jc w:val="right"/>
+        <w:rPr>
+          <w:b/>
+          <w:bCs/>
+        </w:rPr>
+      </w:pPr>
+      <w:r>
+        <w:rPr>
+          <w:b/>
+          <w:bCs/>
+        </w:rPr>
+        <w:t>Orientador: Ramos Panzo</w:t>
+      </w:r>
+    </w:p>
+    <w:bookmarkEnd w:id="2"/>
     <w:p/>
     <w:p/>
     <w:p>
       <w:pPr>
         <w:jc w:val="center"/>
-        <w:rPr>
-          <w:sz w:val="22"/>
-          <w:szCs w:val="20"/>
-        </w:rPr>
-      </w:pPr>
-    </w:p>
-    <w:p>
-      <w:pPr>
+      </w:pPr>
+      <w:bookmarkStart w:id="3" w:name="_Hlk219917925"/>
+      <w:r>
+        <w:t>Icolo e Bengo</w:t>
+      </w:r>
+      <w:r>
+        <w:t>,</w:t>
+      </w:r>
+      <w:r>
+        <w:t xml:space="preserve"> 2025/2026</w:t>
+      </w:r>
+    </w:p>
+    <w:bookmarkEnd w:id="3"/>
+    <w:p>
+      <w:pPr>
+        <w:spacing w:before="0" w:after="160" w:line="259" w:lineRule="auto"/>
+        <w:ind w:firstLine="0"/>
+        <w:jc w:val="left"/>
+        <w:rPr>
+          <w:rFonts w:eastAsiaTheme="majorEastAsia" w:cstheme="majorBidi"/>
+          <w:b/>
+          <w:color w:val="161616" w:themeColor="accent1" w:themeShade="1A"/>
+          <w:sz w:val="28"/>
+          <w:szCs w:val="40"/>
+        </w:rPr>
+      </w:pPr>
+      <w:r>
+        <w:rPr>
+          <w:rFonts w:eastAsiaTheme="majorEastAsia" w:cstheme="majorBidi"/>
+          <w:b/>
+          <w:color w:val="161616" w:themeColor="accent1" w:themeShade="1A"/>
+          <w:sz w:val="28"/>
+          <w:szCs w:val="40"/>
+        </w:rPr>
+        <w:br w:type="page"/>
+      </w:r>
+    </w:p>
+    <w:p>
+      <w:pPr>
+        <w:spacing w:before="0" w:after="160" w:line="259" w:lineRule="auto"/>
+        <w:ind w:firstLine="0"/>
+        <w:jc w:val="left"/>
+        <w:rPr>
+          <w:rFonts w:eastAsiaTheme="majorEastAsia" w:cstheme="majorBidi"/>
+          <w:b/>
+          <w:color w:val="161616" w:themeColor="accent1" w:themeShade="1A"/>
+          <w:sz w:val="28"/>
+          <w:szCs w:val="40"/>
+        </w:rPr>
+      </w:pPr>
+      <w:bookmarkStart w:id="4" w:name="_Hlk219917955"/>
+      <w:r>
+        <w:rPr>
+          <w:rFonts w:eastAsiaTheme="majorEastAsia" w:cstheme="majorBidi"/>
+          <w:b/>
+          <w:color w:val="161616" w:themeColor="accent1" w:themeShade="1A"/>
+          <w:sz w:val="28"/>
+          <w:szCs w:val="40"/>
+        </w:rPr>
+        <w:lastRenderedPageBreak/>
+        <w:t>FOLHA DE APROVAÇÃO</w:t>
+      </w:r>
+    </w:p>
+    <w:p>
+      <w:pPr>
+        <w:spacing w:before="0" w:after="0"/>
+        <w:ind w:left="709" w:firstLine="0"/>
         <w:jc w:val="center"/>
         <w:rPr>
-          <w:sz w:val="32"/>
-          <w:szCs w:val="32"/>
-        </w:rPr>
-      </w:pPr>
-      <w:r>
-        <w:rPr>
-          <w:sz w:val="32"/>
-          <w:szCs w:val="32"/>
-        </w:rPr>
-        <w:t xml:space="preserve">SISTEMA DE GESTÃO DE DECLARAÇÕES </w:t>
-      </w:r>
-      <w:r>
-        <w:rPr>
-          <w:sz w:val="32"/>
-          <w:szCs w:val="32"/>
-        </w:rPr>
-        <w:t xml:space="preserve">ESCOLARES </w:t>
-      </w:r>
-      <w:r>
-        <w:rPr>
-          <w:sz w:val="32"/>
-          <w:szCs w:val="32"/>
-        </w:rPr>
-        <w:t xml:space="preserve">PARA </w:t>
-      </w:r>
-      <w:r>
-        <w:rPr>
-          <w:sz w:val="32"/>
-          <w:szCs w:val="32"/>
-        </w:rPr>
-        <w:t xml:space="preserve"> A</w:t>
-      </w:r>
-      <w:r>
-        <w:rPr>
-          <w:sz w:val="32"/>
-          <w:szCs w:val="32"/>
-        </w:rPr>
-        <w:t xml:space="preserve"> SECRETÁRIA DO INSTITUTO POLITÉCNICO DO MAIOMBE-3050</w:t>
-      </w:r>
-    </w:p>
-    <w:p>
-      <w:pPr>
+          <w:b/>
+          <w:bCs/>
+          <w:szCs w:val="24"/>
+        </w:rPr>
+      </w:pPr>
+    </w:p>
+    <w:p>
+      <w:pPr>
+        <w:spacing w:before="0" w:after="0"/>
+        <w:ind w:firstLine="0"/>
         <w:jc w:val="center"/>
         <w:rPr>
-          <w:sz w:val="32"/>
-          <w:szCs w:val="32"/>
-        </w:rPr>
-      </w:pPr>
-    </w:p>
-    <w:p/>
-    <w:p/>
-    <w:p/>
-    <w:p/>
-    <w:p/>
-    <w:p/>
-    <w:p/>
-    <w:p/>
-    <w:p/>
-    <w:p/>
-    <w:p/>
-    <w:p>
-      <w:pPr>
+          <w:b/>
+          <w:bCs/>
+          <w:szCs w:val="24"/>
+        </w:rPr>
+      </w:pPr>
+      <w:r>
+        <w:rPr>
+          <w:b/>
+          <w:bCs/>
+          <w:szCs w:val="24"/>
+        </w:rPr>
+        <w:t>Antonio Valente</w:t>
+      </w:r>
+    </w:p>
+    <w:p>
+      <w:pPr>
+        <w:spacing w:before="0" w:after="0"/>
+        <w:ind w:firstLine="0"/>
         <w:jc w:val="center"/>
-      </w:pPr>
-      <w:r>
-        <w:t>Icolo e Bengo 2025/2026</w:t>
-      </w:r>
+        <w:rPr>
+          <w:b/>
+          <w:bCs/>
+          <w:szCs w:val="24"/>
+        </w:rPr>
+      </w:pPr>
+      <w:r>
+        <w:rPr>
+          <w:b/>
+          <w:bCs/>
+          <w:szCs w:val="24"/>
+        </w:rPr>
+        <w:t>Gabriel Pedro Aurélio</w:t>
+      </w:r>
+    </w:p>
+    <w:p>
+      <w:pPr>
+        <w:spacing w:before="0" w:after="0"/>
+        <w:ind w:firstLine="0"/>
+        <w:jc w:val="center"/>
+        <w:rPr>
+          <w:b/>
+          <w:bCs/>
+          <w:szCs w:val="24"/>
+        </w:rPr>
+      </w:pPr>
+      <w:r>
+        <w:rPr>
+          <w:b/>
+          <w:bCs/>
+          <w:szCs w:val="24"/>
+        </w:rPr>
+        <w:t>Helena Setas da Cruz</w:t>
+      </w:r>
+    </w:p>
+    <w:p>
+      <w:pPr>
+        <w:spacing w:before="0" w:after="0"/>
+        <w:ind w:firstLine="0"/>
+        <w:jc w:val="center"/>
+        <w:rPr>
+          <w:b/>
+          <w:bCs/>
+          <w:szCs w:val="24"/>
+        </w:rPr>
+      </w:pPr>
+      <w:r>
+        <w:rPr>
+          <w:b/>
+          <w:bCs/>
+          <w:szCs w:val="24"/>
+        </w:rPr>
+        <w:t>Raúl Paulo Neto</w:t>
+      </w:r>
+    </w:p>
+    <w:p>
+      <w:pPr>
+        <w:spacing w:before="0" w:after="0"/>
+        <w:ind w:firstLine="0"/>
+        <w:jc w:val="center"/>
+        <w:rPr>
+          <w:b/>
+          <w:bCs/>
+          <w:szCs w:val="24"/>
+        </w:rPr>
+      </w:pPr>
+      <w:r>
+        <w:rPr>
+          <w:b/>
+          <w:bCs/>
+          <w:szCs w:val="24"/>
+        </w:rPr>
+        <w:t>Shelcia Domingos Manuel</w:t>
+      </w:r>
+    </w:p>
+    <w:p>
+      <w:pPr>
+        <w:spacing w:before="0" w:after="0"/>
+        <w:ind w:firstLine="0"/>
+        <w:jc w:val="center"/>
+        <w:rPr>
+          <w:b/>
+          <w:bCs/>
+          <w:szCs w:val="24"/>
+        </w:rPr>
+      </w:pPr>
+    </w:p>
+    <w:p>
+      <w:pPr>
+        <w:jc w:val="center"/>
+        <w:rPr>
+          <w:rFonts w:cs="Arial"/>
+          <w:b/>
+        </w:rPr>
+      </w:pPr>
+      <w:r>
+        <w:rPr>
+          <w:rFonts w:cs="Arial"/>
+        </w:rPr>
+        <w:t>Este trabalho de fim-de-curso foi julgado e aprovado para obtenção do grau</w:t>
+      </w:r>
+      <w:r>
+        <w:rPr>
+          <w:rFonts w:cs="Arial"/>
+        </w:rPr>
+        <w:t xml:space="preserve"> </w:t>
+      </w:r>
+      <w:r>
+        <w:rPr>
+          <w:rFonts w:cs="Arial"/>
+        </w:rPr>
+        <w:t xml:space="preserve">de Técnico Médio no curso de informática </w:t>
+      </w:r>
+      <w:r>
+        <w:rPr>
+          <w:rFonts w:cs="Arial"/>
+        </w:rPr>
+        <w:t xml:space="preserve">de Gestão </w:t>
+      </w:r>
+      <w:r>
+        <w:rPr>
+          <w:rFonts w:cs="Arial"/>
+        </w:rPr>
+        <w:t>no</w:t>
+      </w:r>
+      <w:r>
+        <w:rPr>
+          <w:rFonts w:cs="Arial"/>
+          <w:b/>
+        </w:rPr>
+        <w:t xml:space="preserve"> Instituto Politécnico do Maiombe IB Nº</w:t>
+      </w:r>
+      <w:r>
+        <w:rPr>
+          <w:rFonts w:cs="Arial"/>
+          <w:b/>
+        </w:rPr>
+        <w:t xml:space="preserve"> </w:t>
+      </w:r>
+      <w:r>
+        <w:rPr>
+          <w:rFonts w:cs="Arial"/>
+          <w:b/>
+        </w:rPr>
+        <w:t>3050 EX. 4023 – SEQUELE no dia____/____/____.</w:t>
+      </w:r>
+    </w:p>
+    <w:p>
+      <w:pPr>
+        <w:ind w:firstLine="0"/>
+        <w:jc w:val="center"/>
+        <w:rPr>
+          <w:rFonts w:cs="Arial"/>
+        </w:rPr>
+      </w:pPr>
+      <w:r>
+        <w:rPr>
+          <w:rFonts w:cs="Arial"/>
+        </w:rPr>
+        <w:t>Foi apresentado e definido perante o júri composto pelos professores:</w:t>
+      </w:r>
+    </w:p>
+    <w:p>
+      <w:pPr>
+        <w:rPr>
+          <w:rFonts w:cs="Arial"/>
+          <w:b/>
+        </w:rPr>
+      </w:pPr>
+    </w:p>
+    <w:p>
+      <w:pPr>
+        <w:jc w:val="center"/>
+        <w:rPr>
+          <w:rFonts w:cs="Arial"/>
+          <w:b/>
+        </w:rPr>
+      </w:pPr>
+      <w:r>
+        <w:rPr>
+          <w:rFonts w:cs="Arial"/>
+          <w:b/>
+        </w:rPr>
+        <w:t>Presidente do Júri</w:t>
+      </w:r>
+    </w:p>
+    <w:p>
+      <w:pPr>
+        <w:jc w:val="center"/>
+        <w:rPr>
+          <w:rFonts w:cs="Arial"/>
+          <w:b/>
+          <w:sz w:val="28"/>
+        </w:rPr>
+      </w:pPr>
+      <w:r>
+        <w:rPr>
+          <w:rFonts w:cs="Arial"/>
+          <w:b/>
+          <w:sz w:val="28"/>
+        </w:rPr>
+        <w:t>_________________________________________________</w:t>
+      </w:r>
+      <w:r>
+        <w:rPr>
+          <w:rFonts w:cs="Arial"/>
+          <w:b/>
+          <w:sz w:val="28"/>
+        </w:rPr>
+        <w:cr/>
+      </w:r>
+    </w:p>
+    <w:p>
+      <w:pPr>
+        <w:jc w:val="center"/>
+        <w:rPr>
+          <w:rFonts w:cs="Arial"/>
+          <w:b/>
+        </w:rPr>
+      </w:pPr>
+      <w:r>
+        <w:rPr>
+          <w:rFonts w:cs="Arial"/>
+          <w:b/>
+        </w:rPr>
+        <w:t>Primeiro Vogal</w:t>
+      </w:r>
+    </w:p>
+    <w:p>
+      <w:pPr>
+        <w:jc w:val="center"/>
+        <w:rPr>
+          <w:rFonts w:cs="Arial"/>
+          <w:b/>
+        </w:rPr>
+      </w:pPr>
+      <w:r>
+        <w:rPr>
+          <w:rFonts w:cs="Arial"/>
+          <w:b/>
+        </w:rPr>
+        <w:t>__________________________________________________________</w:t>
+      </w:r>
+    </w:p>
+    <w:p>
+      <w:pPr>
+        <w:jc w:val="center"/>
+        <w:rPr>
+          <w:rFonts w:cs="Arial"/>
+          <w:b/>
+        </w:rPr>
+      </w:pPr>
+    </w:p>
+    <w:p>
+      <w:pPr>
+        <w:jc w:val="center"/>
+        <w:rPr>
+          <w:rFonts w:cs="Arial"/>
+          <w:b/>
+        </w:rPr>
+      </w:pPr>
+      <w:r>
+        <w:rPr>
+          <w:rFonts w:cs="Arial"/>
+          <w:b/>
+        </w:rPr>
+        <w:t>Segundo Vogal.</w:t>
+      </w:r>
+    </w:p>
+    <w:p>
+      <w:pPr>
+        <w:jc w:val="center"/>
+        <w:rPr>
+          <w:rFonts w:cs="Arial"/>
+          <w:b/>
+        </w:rPr>
+      </w:pPr>
+      <w:r>
+        <w:rPr>
+          <w:rFonts w:cs="Arial"/>
+          <w:b/>
+        </w:rPr>
+        <w:t>__________________________________________________________</w:t>
+      </w:r>
+      <w:bookmarkEnd w:id="4"/>
+    </w:p>
+    <w:p>
+      <w:pPr>
+        <w:ind w:firstLine="0"/>
+        <w:rPr>
+          <w:rFonts w:cs="Arial"/>
+          <w:b/>
+        </w:rPr>
+        <w:sectPr>
+          <w:footerReference w:type="default" r:id="rId10"/>
+          <w:pgSz w:w="11906" w:h="16838"/>
+          <w:pgMar w:top="1417" w:right="1701" w:bottom="1417" w:left="1701" w:header="708" w:footer="708" w:gutter="0"/>
+          <w:cols w:space="708"/>
+          <w:docGrid w:linePitch="360"/>
+        </w:sectPr>
+      </w:pPr>
     </w:p>
     <w:p>
       <w:pPr>
         <w:pStyle w:val="Heading1"/>
       </w:pPr>
-      <w:r>
-        <w:br w:type="page"/>
-      </w:r>
       <w:r>
         <w:lastRenderedPageBreak/>
         <w:t xml:space="preserve">Dedicatória </w:t>
       </w:r>
     </w:p>
     <w:p>
+      <w:bookmarkStart w:id="5" w:name="_Hlk219918033"/>
       <w:r>
         <w:t>Gabriel Pedro Aurélio</w:t>
       </w:r>
@@ -359,6 +1118,7 @@
         <w:t>Eu dedico este Trabalho a minha Mãe Eva Nogueira Pedro que sempre me apoiou em todas as fases da minha educação, dando me segurança, disciplina, incentivo apoio financeiro e um colo onde eu ia sempre chorar quando as coisas não estavam bem, agradeço por tudo e espero que a Senhora Minha Mãe tenha orgulho do seu filho primogénito.</w:t>
       </w:r>
     </w:p>
+    <w:bookmarkEnd w:id="5"/>
     <w:p>
       <w:pPr>
         <w:ind w:firstLine="0"/>
@@ -378,6 +1138,7 @@
       </w:r>
     </w:p>
     <w:p>
+      <w:bookmarkStart w:id="6" w:name="_Hlk219918051"/>
       <w:r>
         <w:t>Primeiramente,</w:t>
       </w:r>
@@ -442,6 +1203,7 @@
         <w:t xml:space="preserve"> </w:t>
       </w:r>
     </w:p>
+    <w:bookmarkEnd w:id="6"/>
     <w:p>
       <w:r>
         <w:br w:type="page"/>
@@ -454,14 +1216,31 @@
       </w:pPr>
       <w:r>
         <w:lastRenderedPageBreak/>
-        <w:t>Epígrafe</w:t>
-      </w:r>
-    </w:p>
-    <w:p>
-      <w:r>
-        <w:t>“A tecnologia é melhor quando aproxima as pessoas.” – Matt Mullenweg</w:t>
-      </w:r>
-    </w:p>
+        <w:t>EPÍGRAFE</w:t>
+      </w:r>
+    </w:p>
+    <w:p>
+      <w:bookmarkStart w:id="7" w:name="_Hlk219918068"/>
+      <w:r>
+        <w:t>“A tecnologia é melhor quando aproxima as pessoas.”</w:t>
+      </w:r>
+    </w:p>
+    <w:p>
+      <w:pPr>
+        <w:rPr>
+          <w:b/>
+          <w:bCs/>
+        </w:rPr>
+      </w:pPr>
+      <w:r>
+        <w:rPr>
+          <w:b/>
+          <w:bCs/>
+        </w:rPr>
+        <w:t xml:space="preserve"> Matt Mullenweg</w:t>
+      </w:r>
+    </w:p>
+    <w:bookmarkEnd w:id="7"/>
     <w:p>
       <w:r>
         <w:br w:type="page"/>
@@ -513,6 +1292,7 @@
           <w:color w:val="FF0000"/>
         </w:rPr>
       </w:pPr>
+      <w:bookmarkStart w:id="8" w:name="_Hlk219918128"/>
       <w:r>
         <w:rPr>
           <w:color w:val="FF0000"/>
@@ -694,6 +1474,7 @@
         <w:t>Orientação a Objectos</w:t>
       </w:r>
     </w:p>
+    <w:bookmarkEnd w:id="8"/>
     <w:p>
       <w:pPr>
         <w:ind w:firstLine="708"/>
@@ -738,6 +1519,7 @@
       </w:r>
     </w:p>
     <w:p>
+      <w:bookmarkStart w:id="9" w:name="_Hlk219918097"/>
       <w:r>
         <w:t>O presente projeto tem como objetivo a concepção e desenvolvimento de um sistema informatizado para a gestão de declarações no Instituto Politécnico do Maiombe. Atualmente, a instituição enfrenta dificuldades na administração de solicitações de declarações devido ao aumento do volume de pedidos, uso de processos manuais e a falta de rastreabilidade adequada, o que ocasiona atrasos, erros e perda de documentos importantes.</w:t>
       </w:r>
@@ -781,6 +1563,7 @@
       <w:r>
         <w:t>Sistema</w:t>
       </w:r>
+      <w:bookmarkEnd w:id="9"/>
       <w:r>
         <w:br w:type="page"/>
       </w:r>
@@ -830,6 +1613,7 @@
         <w:pStyle w:val="Heading1"/>
         <w:ind w:firstLine="0"/>
       </w:pPr>
+      <w:bookmarkStart w:id="10" w:name="_Hlk219918242"/>
       <w:r>
         <w:lastRenderedPageBreak/>
         <w:t>Problemática</w:t>
@@ -896,6 +1680,7 @@
         <w:t>?</w:t>
       </w:r>
     </w:p>
+    <w:bookmarkEnd w:id="10"/>
     <w:p>
       <w:pPr>
         <w:spacing w:before="0" w:after="160" w:line="259" w:lineRule="auto"/>
@@ -919,6 +1704,7 @@
         <w:pStyle w:val="Heading1"/>
         <w:ind w:firstLine="0"/>
       </w:pPr>
+      <w:bookmarkStart w:id="11" w:name="_Hlk219918285"/>
       <w:r>
         <w:lastRenderedPageBreak/>
         <w:t>Hipótese</w:t>
@@ -977,6 +1763,8 @@
         <w:pStyle w:val="Heading1"/>
         <w:ind w:firstLine="0"/>
       </w:pPr>
+      <w:bookmarkStart w:id="12" w:name="_Hlk219918332"/>
+      <w:bookmarkEnd w:id="11"/>
       <w:r>
         <w:t>Objetivos</w:t>
       </w:r>
@@ -1066,6 +1854,7 @@
         <w:t>Automatizar os processos de emissão e controle de declarações, proporcionando maior agilidade e precisão no atendimento às solicitações.</w:t>
       </w:r>
     </w:p>
+    <w:bookmarkEnd w:id="12"/>
     <w:p>
       <w:pPr>
         <w:spacing w:before="0" w:after="160" w:line="259" w:lineRule="auto"/>
@@ -1096,6 +1885,7 @@
       <w:pPr>
         <w:pStyle w:val="Heading2"/>
       </w:pPr>
+      <w:bookmarkStart w:id="13" w:name="_Hlk219918377"/>
       <w:r>
         <w:lastRenderedPageBreak/>
         <w:t>Justificativa</w:t>
@@ -1122,6 +1912,8 @@
         <w:pStyle w:val="Heading1"/>
         <w:ind w:firstLine="0"/>
       </w:pPr>
+      <w:bookmarkStart w:id="14" w:name="_Hlk219918405"/>
+      <w:bookmarkEnd w:id="13"/>
       <w:r>
         <w:t>Delimitação</w:t>
       </w:r>
@@ -1231,6 +2023,7 @@
         <w:br w:type="page"/>
       </w:r>
     </w:p>
+    <w:bookmarkEnd w:id="14"/>
     <w:p>
       <w:pPr>
         <w:pStyle w:val="Heading1"/>
@@ -1257,6 +2050,7 @@
           <w:szCs w:val="32"/>
         </w:rPr>
       </w:pPr>
+      <w:bookmarkStart w:id="15" w:name="_Hlk220239105"/>
       <w:r>
         <w:t>O estudo adota uma abordagem quali-quantitativa, combinando métodos qualitativos e quantitativos, com o objetivo de descrever e analisar as dificuldades enfrentadas pelo Instituto Politécnico do Maiombe na gestão das declarações. A abordagem qualitativa permite compreender aspectos subjetivos e organizacionais, enquanto a abordagem quantitativa possibilita medir a frequência</w:t>
       </w:r>
@@ -1269,6 +2063,7 @@
         <w:t xml:space="preserve"> e a magnitude dos problemas identificados.</w:t>
       </w:r>
     </w:p>
+    <w:bookmarkEnd w:id="15"/>
     <w:p>
       <w:pPr>
         <w:pStyle w:val="Heading2"/>
@@ -1297,6 +2092,7 @@
       </w:r>
     </w:p>
     <w:p>
+      <w:bookmarkStart w:id="16" w:name="_Hlk220239533"/>
       <w:r>
         <w:t xml:space="preserve">A coleta de dados foi realizada por meio de entrevistas semiestruturadas e questionários estruturados aplicados às secretárias da instituição. As entrevistas buscaram compreender de forma detalhada as dificuldades e limitações dos processos manuais, enquanto os questionários possibilitaram quantificar aspectos </w:t>
       </w:r>
@@ -1316,6 +2112,7 @@
         <w:br w:type="page"/>
       </w:r>
     </w:p>
+    <w:bookmarkEnd w:id="16"/>
     <w:p>
       <w:pPr>
         <w:pStyle w:val="Heading1"/>
@@ -1332,6 +2129,7 @@
           <w:lang w:val="pt-AO"/>
         </w:rPr>
       </w:pPr>
+      <w:bookmarkStart w:id="17" w:name="_Hlk219918175"/>
       <w:r>
         <w:rPr>
           <w:lang w:val="pt-AO"/>
@@ -1437,6 +2235,7 @@
         <w:t>que interagem com a instituição.</w:t>
       </w:r>
     </w:p>
+    <w:bookmarkEnd w:id="17"/>
     <w:p>
       <w:pPr>
         <w:rPr>
@@ -1850,6 +2649,7 @@
         <w:rPr>
           <w:lang w:val="pt-BR"/>
         </w:rPr>
+        <w:lastRenderedPageBreak/>
         <w:t>Banco de Dados</w:t>
       </w:r>
     </w:p>
@@ -1863,14 +2663,7 @@
         <w:rPr>
           <w:lang w:val="pt-BR"/>
         </w:rPr>
-        <w:t xml:space="preserve">O sistema utiliza PostgreSQL como banco de dados relacional, permitindo armazenar informações de forma estruturada e segura. A escolha do </w:t>
-      </w:r>
-      <w:r>
-        <w:rPr>
-          <w:lang w:val="pt-BR"/>
-        </w:rPr>
-        <w:lastRenderedPageBreak/>
-        <w:t>PostgreSQL se justifica por sua robustez, suporte a transações complexas, performance em consultas e capacidade de integridade referencial, fatores essenciais para um sistema que lida com dados acadêmicos e administrativos sensíveis.</w:t>
+        <w:t>O sistema utiliza PostgreSQL como banco de dados relacional, permitindo armazenar informações de forma estruturada e segura. A escolha do PostgreSQL se justifica por sua robustez, suporte a transações complexas, performance em consultas e capacidade de integridade referencial, fatores essenciais para um sistema que lida com dados acadêmicos e administrativos sensíveis.</w:t>
       </w:r>
     </w:p>
     <w:p>
@@ -2169,9 +2962,162 @@
 </w:document>
 </file>
 
+<file path=word/endnotes.xml><?xml version="1.0" encoding="utf-8"?>
+<w:endnotes xmlns:wpc="http://schemas.microsoft.com/office/word/2010/wordprocessingCanvas" xmlns:cx="http://schemas.microsoft.com/office/drawing/2014/chartex" xmlns:cx1="http://schemas.microsoft.com/office/drawing/2015/9/8/chartex" xmlns:cx2="http://schemas.microsoft.com/office/drawing/2015/10/21/chartex" xmlns:cx3="http://schemas.microsoft.com/office/drawing/2016/5/9/chartex" xmlns:cx4="http://schemas.microsoft.com/office/drawing/2016/5/10/chartex" xmlns:cx5="http://schemas.microsoft.com/office/drawing/2016/5/11/chartex" xmlns:cx6="http://schemas.microsoft.com/office/drawing/2016/5/12/chartex" xmlns:cx7="http://schemas.microsoft.com/office/drawing/2016/5/13/chartex" xmlns:cx8="http://schemas.microsoft.com/office/drawing/2016/5/14/chartex" xmlns:mc="http://schemas.openxmlformats.org/markup-compatibility/2006" xmlns:aink="http://schemas.microsoft.com/office/drawing/2016/ink" xmlns:am3d="http://schemas.microsoft.com/office/drawing/2017/model3d" xmlns:o="urn:schemas-microsoft-com:office:office" xmlns:oel="http://schemas.microsoft.com/office/2019/extlst" xmlns:r="http://schemas.openxmlformats.org/officeDocument/2006/relationships" xmlns:m="http://schemas.openxmlformats.org/officeDocument/2006/math" xmlns:v="urn:schemas-microsoft-com:vml" xmlns:wp14="http://schemas.microsoft.com/office/word/2010/wordprocessingDrawing" xmlns:wp="http://schemas.openxmlformats.org/drawingml/2006/wordprocessingDrawing" xmlns:w10="urn:schemas-microsoft-com:office:word" xmlns:w="http://schemas.openxmlformats.org/wordprocessingml/2006/main" xmlns:w14="http://schemas.microsoft.com/office/word/2010/wordml" xmlns:w15="http://schemas.microsoft.com/office/word/2012/wordml" xmlns:w16cex="http://schemas.microsoft.com/office/word/2018/wordml/cex" xmlns:w16cid="http://schemas.microsoft.com/office/word/2016/wordml/cid" xmlns:w16="http://schemas.microsoft.com/office/word/2018/wordml" xmlns:w16du="http://schemas.microsoft.com/office/word/2023/wordml/word16du" xmlns:w16sdtdh="http://schemas.microsoft.com/office/word/2020/wordml/sdtdatahash" xmlns:w16se="http://schemas.microsoft.com/office/word/2015/wordml/symex" xmlns:wpg="http://schemas.microsoft.com/office/word/2010/wordprocessingGroup" xmlns:wpi="http://schemas.microsoft.com/office/word/2010/wordprocessingInk" xmlns:wne="http://schemas.microsoft.com/office/word/2006/wordml" xmlns:wps="http://schemas.microsoft.com/office/word/2010/wordprocessingShape" mc:Ignorable="w14 w15 w16se w16cid w16 w16cex w16sdtdh w16du wp14">
+  <w:endnote w:type="separator" w:id="-1">
+    <w:p>
+      <w:pPr>
+        <w:spacing w:before="0" w:after="0" w:line="240" w:lineRule="auto"/>
+      </w:pPr>
+      <w:r>
+        <w:separator/>
+      </w:r>
+    </w:p>
+  </w:endnote>
+  <w:endnote w:type="continuationSeparator" w:id="0">
+    <w:p>
+      <w:pPr>
+        <w:spacing w:before="0" w:after="0" w:line="240" w:lineRule="auto"/>
+      </w:pPr>
+      <w:r>
+        <w:continuationSeparator/>
+      </w:r>
+    </w:p>
+  </w:endnote>
+</w:endnotes>
+</file>
+
+<file path=word/footer1.xml><?xml version="1.0" encoding="utf-8"?>
+<w:ftr xmlns:wpc="http://schemas.microsoft.com/office/word/2010/wordprocessingCanvas" xmlns:cx="http://schemas.microsoft.com/office/drawing/2014/chartex" xmlns:cx1="http://schemas.microsoft.com/office/drawing/2015/9/8/chartex" xmlns:cx2="http://schemas.microsoft.com/office/drawing/2015/10/21/chartex" xmlns:cx3="http://schemas.microsoft.com/office/drawing/2016/5/9/chartex" xmlns:cx4="http://schemas.microsoft.com/office/drawing/2016/5/10/chartex" xmlns:cx5="http://schemas.microsoft.com/office/drawing/2016/5/11/chartex" xmlns:cx6="http://schemas.microsoft.com/office/drawing/2016/5/12/chartex" xmlns:cx7="http://schemas.microsoft.com/office/drawing/2016/5/13/chartex" xmlns:cx8="http://schemas.microsoft.com/office/drawing/2016/5/14/chartex" xmlns:mc="http://schemas.openxmlformats.org/markup-compatibility/2006" xmlns:aink="http://schemas.microsoft.com/office/drawing/2016/ink" xmlns:am3d="http://schemas.microsoft.com/office/drawing/2017/model3d" xmlns:o="urn:schemas-microsoft-com:office:office" xmlns:oel="http://schemas.microsoft.com/office/2019/extlst" xmlns:r="http://schemas.openxmlformats.org/officeDocument/2006/relationships" xmlns:m="http://schemas.openxmlformats.org/officeDocument/2006/math" xmlns:v="urn:schemas-microsoft-com:vml" xmlns:wp14="http://schemas.microsoft.com/office/word/2010/wordprocessingDrawing" xmlns:wp="http://schemas.openxmlformats.org/drawingml/2006/wordprocessingDrawing" xmlns:w10="urn:schemas-microsoft-com:office:word" xmlns:w="http://schemas.openxmlformats.org/wordprocessingml/2006/main" xmlns:w14="http://schemas.microsoft.com/office/word/2010/wordml" xmlns:w15="http://schemas.microsoft.com/office/word/2012/wordml" xmlns:w16cex="http://schemas.microsoft.com/office/word/2018/wordml/cex" xmlns:w16cid="http://schemas.microsoft.com/office/word/2016/wordml/cid" xmlns:w16="http://schemas.microsoft.com/office/word/2018/wordml" xmlns:w16du="http://schemas.microsoft.com/office/word/2023/wordml/word16du" xmlns:w16sdtdh="http://schemas.microsoft.com/office/word/2020/wordml/sdtdatahash" xmlns:w16se="http://schemas.microsoft.com/office/word/2015/wordml/symex" xmlns:wpg="http://schemas.microsoft.com/office/word/2010/wordprocessingGroup" xmlns:wpi="http://schemas.microsoft.com/office/word/2010/wordprocessingInk" xmlns:wne="http://schemas.microsoft.com/office/word/2006/wordml" xmlns:wps="http://schemas.microsoft.com/office/word/2010/wordprocessingShape" mc:Ignorable="w14 w15 w16se w16cid w16 w16cex w16sdtdh w16du wp14">
+  <w:p>
+    <w:pPr>
+      <w:rPr>
+        <w:rFonts w:asciiTheme="majorHAnsi" w:eastAsiaTheme="majorEastAsia" w:hAnsiTheme="majorHAnsi" w:cstheme="majorBidi"/>
+      </w:rPr>
+    </w:pPr>
+  </w:p>
+  <w:p>
+    <w:pPr>
+      <w:pStyle w:val="Footer"/>
+    </w:pPr>
+  </w:p>
+</w:ftr>
+</file>
+
+<file path=word/footnotes.xml><?xml version="1.0" encoding="utf-8"?>
+<w:footnotes xmlns:wpc="http://schemas.microsoft.com/office/word/2010/wordprocessingCanvas" xmlns:cx="http://schemas.microsoft.com/office/drawing/2014/chartex" xmlns:cx1="http://schemas.microsoft.com/office/drawing/2015/9/8/chartex" xmlns:cx2="http://schemas.microsoft.com/office/drawing/2015/10/21/chartex" xmlns:cx3="http://schemas.microsoft.com/office/drawing/2016/5/9/chartex" xmlns:cx4="http://schemas.microsoft.com/office/drawing/2016/5/10/chartex" xmlns:cx5="http://schemas.microsoft.com/office/drawing/2016/5/11/chartex" xmlns:cx6="http://schemas.microsoft.com/office/drawing/2016/5/12/chartex" xmlns:cx7="http://schemas.microsoft.com/office/drawing/2016/5/13/chartex" xmlns:cx8="http://schemas.microsoft.com/office/drawing/2016/5/14/chartex" xmlns:mc="http://schemas.openxmlformats.org/markup-compatibility/2006" xmlns:aink="http://schemas.microsoft.com/office/drawing/2016/ink" xmlns:am3d="http://schemas.microsoft.com/office/drawing/2017/model3d" xmlns:o="urn:schemas-microsoft-com:office:office" xmlns:oel="http://schemas.microsoft.com/office/2019/extlst" xmlns:r="http://schemas.openxmlformats.org/officeDocument/2006/relationships" xmlns:m="http://schemas.openxmlformats.org/officeDocument/2006/math" xmlns:v="urn:schemas-microsoft-com:vml" xmlns:wp14="http://schemas.microsoft.com/office/word/2010/wordprocessingDrawing" xmlns:wp="http://schemas.openxmlformats.org/drawingml/2006/wordprocessingDrawing" xmlns:w10="urn:schemas-microsoft-com:office:word" xmlns:w="http://schemas.openxmlformats.org/wordprocessingml/2006/main" xmlns:w14="http://schemas.microsoft.com/office/word/2010/wordml" xmlns:w15="http://schemas.microsoft.com/office/word/2012/wordml" xmlns:w16cex="http://schemas.microsoft.com/office/word/2018/wordml/cex" xmlns:w16cid="http://schemas.microsoft.com/office/word/2016/wordml/cid" xmlns:w16="http://schemas.microsoft.com/office/word/2018/wordml" xmlns:w16du="http://schemas.microsoft.com/office/word/2023/wordml/word16du" xmlns:w16sdtdh="http://schemas.microsoft.com/office/word/2020/wordml/sdtdatahash" xmlns:w16se="http://schemas.microsoft.com/office/word/2015/wordml/symex" xmlns:wpg="http://schemas.microsoft.com/office/word/2010/wordprocessingGroup" xmlns:wpi="http://schemas.microsoft.com/office/word/2010/wordprocessingInk" xmlns:wne="http://schemas.microsoft.com/office/word/2006/wordml" xmlns:wps="http://schemas.microsoft.com/office/word/2010/wordprocessingShape" mc:Ignorable="w14 w15 w16se w16cid w16 w16cex w16sdtdh w16du wp14">
+  <w:footnote w:type="separator" w:id="-1">
+    <w:p>
+      <w:pPr>
+        <w:spacing w:before="0" w:after="0" w:line="240" w:lineRule="auto"/>
+      </w:pPr>
+      <w:r>
+        <w:separator/>
+      </w:r>
+    </w:p>
+  </w:footnote>
+  <w:footnote w:type="continuationSeparator" w:id="0">
+    <w:p>
+      <w:pPr>
+        <w:spacing w:before="0" w:after="0" w:line="240" w:lineRule="auto"/>
+      </w:pPr>
+      <w:r>
+        <w:continuationSeparator/>
+      </w:r>
+    </w:p>
+  </w:footnote>
+</w:footnotes>
+</file>
+
 <file path=word/numbering.xml><?xml version="1.0" encoding="utf-8"?>
 <w:numbering xmlns:wpc="http://schemas.microsoft.com/office/word/2010/wordprocessingCanvas" xmlns:cx="http://schemas.microsoft.com/office/drawing/2014/chartex" xmlns:cx1="http://schemas.microsoft.com/office/drawing/2015/9/8/chartex" xmlns:cx2="http://schemas.microsoft.com/office/drawing/2015/10/21/chartex" xmlns:cx3="http://schemas.microsoft.com/office/drawing/2016/5/9/chartex" xmlns:cx4="http://schemas.microsoft.com/office/drawing/2016/5/10/chartex" xmlns:cx5="http://schemas.microsoft.com/office/drawing/2016/5/11/chartex" xmlns:cx6="http://schemas.microsoft.com/office/drawing/2016/5/12/chartex" xmlns:cx7="http://schemas.microsoft.com/office/drawing/2016/5/13/chartex" xmlns:cx8="http://schemas.microsoft.com/office/drawing/2016/5/14/chartex" xmlns:mc="http://schemas.openxmlformats.org/markup-compatibility/2006" xmlns:aink="http://schemas.microsoft.com/office/drawing/2016/ink" xmlns:am3d="http://schemas.microsoft.com/office/drawing/2017/model3d" xmlns:o="urn:schemas-microsoft-com:office:office" xmlns:oel="http://schemas.microsoft.com/office/2019/extlst" xmlns:r="http://schemas.openxmlformats.org/officeDocument/2006/relationships" xmlns:m="http://schemas.openxmlformats.org/officeDocument/2006/math" xmlns:v="urn:schemas-microsoft-com:vml" xmlns:wp14="http://schemas.microsoft.com/office/word/2010/wordprocessingDrawing" xmlns:wp="http://schemas.openxmlformats.org/drawingml/2006/wordprocessingDrawing" xmlns:w10="urn:schemas-microsoft-com:office:word" xmlns:w="http://schemas.openxmlformats.org/wordprocessingml/2006/main" xmlns:w14="http://schemas.microsoft.com/office/word/2010/wordml" xmlns:w15="http://schemas.microsoft.com/office/word/2012/wordml" xmlns:w16cex="http://schemas.microsoft.com/office/word/2018/wordml/cex" xmlns:w16cid="http://schemas.microsoft.com/office/word/2016/wordml/cid" xmlns:w16="http://schemas.microsoft.com/office/word/2018/wordml" xmlns:w16du="http://schemas.microsoft.com/office/word/2023/wordml/word16du" xmlns:w16sdtdh="http://schemas.microsoft.com/office/word/2020/wordml/sdtdatahash" xmlns:w16se="http://schemas.microsoft.com/office/word/2015/wordml/symex" xmlns:wpg="http://schemas.microsoft.com/office/word/2010/wordprocessingGroup" xmlns:wpi="http://schemas.microsoft.com/office/word/2010/wordprocessingInk" xmlns:wne="http://schemas.microsoft.com/office/word/2006/wordml" xmlns:wps="http://schemas.microsoft.com/office/word/2010/wordprocessingShape" mc:Ignorable="w14 w15 w16se w16cid w16 w16cex w16sdtdh w16du wp14">
   <w:abstractNum w:abstractNumId="0" w15:restartNumberingAfterBreak="0">
+    <w:nsid w:val="45E3649F"/>
+    <w:multiLevelType w:val="hybridMultilevel"/>
+    <w:tmpl w:val="018EEFA8"/>
+    <w:lvl w:ilvl="0" w:tplc="0C00000F">
+      <w:start w:val="1"/>
+      <w:numFmt w:val="decimal"/>
+      <w:lvlText w:val="%1."/>
+      <w:lvlJc w:val="left"/>
+      <w:pPr>
+        <w:ind w:left="1429" w:hanging="360"/>
+      </w:pPr>
+    </w:lvl>
+    <w:lvl w:ilvl="1" w:tplc="0C000019" w:tentative="1">
+      <w:start w:val="1"/>
+      <w:numFmt w:val="lowerLetter"/>
+      <w:lvlText w:val="%2."/>
+      <w:lvlJc w:val="left"/>
+      <w:pPr>
+        <w:ind w:left="2149" w:hanging="360"/>
+      </w:pPr>
+    </w:lvl>
+    <w:lvl w:ilvl="2" w:tplc="0C00001B" w:tentative="1">
+      <w:start w:val="1"/>
+      <w:numFmt w:val="lowerRoman"/>
+      <w:lvlText w:val="%3."/>
+      <w:lvlJc w:val="right"/>
+      <w:pPr>
+        <w:ind w:left="2869" w:hanging="180"/>
+      </w:pPr>
+    </w:lvl>
+    <w:lvl w:ilvl="3" w:tplc="0C00000F" w:tentative="1">
+      <w:start w:val="1"/>
+      <w:numFmt w:val="decimal"/>
+      <w:lvlText w:val="%4."/>
+      <w:lvlJc w:val="left"/>
+      <w:pPr>
+        <w:ind w:left="3589" w:hanging="360"/>
+      </w:pPr>
+    </w:lvl>
+    <w:lvl w:ilvl="4" w:tplc="0C000019" w:tentative="1">
+      <w:start w:val="1"/>
+      <w:numFmt w:val="lowerLetter"/>
+      <w:lvlText w:val="%5."/>
+      <w:lvlJc w:val="left"/>
+      <w:pPr>
+        <w:ind w:left="4309" w:hanging="360"/>
+      </w:pPr>
+    </w:lvl>
+    <w:lvl w:ilvl="5" w:tplc="0C00001B" w:tentative="1">
+      <w:start w:val="1"/>
+      <w:numFmt w:val="lowerRoman"/>
+      <w:lvlText w:val="%6."/>
+      <w:lvlJc w:val="right"/>
+      <w:pPr>
+        <w:ind w:left="5029" w:hanging="180"/>
+      </w:pPr>
+    </w:lvl>
+    <w:lvl w:ilvl="6" w:tplc="0C00000F" w:tentative="1">
+      <w:start w:val="1"/>
+      <w:numFmt w:val="decimal"/>
+      <w:lvlText w:val="%7."/>
+      <w:lvlJc w:val="left"/>
+      <w:pPr>
+        <w:ind w:left="5749" w:hanging="360"/>
+      </w:pPr>
+    </w:lvl>
+    <w:lvl w:ilvl="7" w:tplc="0C000019" w:tentative="1">
+      <w:start w:val="1"/>
+      <w:numFmt w:val="lowerLetter"/>
+      <w:lvlText w:val="%8."/>
+      <w:lvlJc w:val="left"/>
+      <w:pPr>
+        <w:ind w:left="6469" w:hanging="360"/>
+      </w:pPr>
+    </w:lvl>
+    <w:lvl w:ilvl="8" w:tplc="0C00001B" w:tentative="1">
+      <w:start w:val="1"/>
+      <w:numFmt w:val="lowerRoman"/>
+      <w:lvlText w:val="%9."/>
+      <w:lvlJc w:val="right"/>
+      <w:pPr>
+        <w:ind w:left="7189" w:hanging="180"/>
+      </w:pPr>
+    </w:lvl>
+  </w:abstractNum>
+  <w:abstractNum w:abstractNumId="1" w15:restartNumberingAfterBreak="0">
     <w:nsid w:val="4F791AA1"/>
     <w:multiLevelType w:val="hybridMultilevel"/>
     <w:tmpl w:val="77043C60"/>
@@ -2284,7 +3230,93 @@
       </w:rPr>
     </w:lvl>
   </w:abstractNum>
-  <w:abstractNum w:abstractNumId="1" w15:restartNumberingAfterBreak="0">
+  <w:abstractNum w:abstractNumId="2" w15:restartNumberingAfterBreak="0">
+    <w:nsid w:val="630746F4"/>
+    <w:multiLevelType w:val="hybridMultilevel"/>
+    <w:tmpl w:val="018EEFA8"/>
+    <w:lvl w:ilvl="0" w:tplc="FFFFFFFF">
+      <w:start w:val="1"/>
+      <w:numFmt w:val="decimal"/>
+      <w:lvlText w:val="%1."/>
+      <w:lvlJc w:val="left"/>
+      <w:pPr>
+        <w:ind w:left="1429" w:hanging="360"/>
+      </w:pPr>
+    </w:lvl>
+    <w:lvl w:ilvl="1" w:tplc="FFFFFFFF" w:tentative="1">
+      <w:start w:val="1"/>
+      <w:numFmt w:val="lowerLetter"/>
+      <w:lvlText w:val="%2."/>
+      <w:lvlJc w:val="left"/>
+      <w:pPr>
+        <w:ind w:left="2149" w:hanging="360"/>
+      </w:pPr>
+    </w:lvl>
+    <w:lvl w:ilvl="2" w:tplc="FFFFFFFF" w:tentative="1">
+      <w:start w:val="1"/>
+      <w:numFmt w:val="lowerRoman"/>
+      <w:lvlText w:val="%3."/>
+      <w:lvlJc w:val="right"/>
+      <w:pPr>
+        <w:ind w:left="2869" w:hanging="180"/>
+      </w:pPr>
+    </w:lvl>
+    <w:lvl w:ilvl="3" w:tplc="FFFFFFFF" w:tentative="1">
+      <w:start w:val="1"/>
+      <w:numFmt w:val="decimal"/>
+      <w:lvlText w:val="%4."/>
+      <w:lvlJc w:val="left"/>
+      <w:pPr>
+        <w:ind w:left="3589" w:hanging="360"/>
+      </w:pPr>
+    </w:lvl>
+    <w:lvl w:ilvl="4" w:tplc="FFFFFFFF" w:tentative="1">
+      <w:start w:val="1"/>
+      <w:numFmt w:val="lowerLetter"/>
+      <w:lvlText w:val="%5."/>
+      <w:lvlJc w:val="left"/>
+      <w:pPr>
+        <w:ind w:left="4309" w:hanging="360"/>
+      </w:pPr>
+    </w:lvl>
+    <w:lvl w:ilvl="5" w:tplc="FFFFFFFF" w:tentative="1">
+      <w:start w:val="1"/>
+      <w:numFmt w:val="lowerRoman"/>
+      <w:lvlText w:val="%6."/>
+      <w:lvlJc w:val="right"/>
+      <w:pPr>
+        <w:ind w:left="5029" w:hanging="180"/>
+      </w:pPr>
+    </w:lvl>
+    <w:lvl w:ilvl="6" w:tplc="FFFFFFFF" w:tentative="1">
+      <w:start w:val="1"/>
+      <w:numFmt w:val="decimal"/>
+      <w:lvlText w:val="%7."/>
+      <w:lvlJc w:val="left"/>
+      <w:pPr>
+        <w:ind w:left="5749" w:hanging="360"/>
+      </w:pPr>
+    </w:lvl>
+    <w:lvl w:ilvl="7" w:tplc="FFFFFFFF" w:tentative="1">
+      <w:start w:val="1"/>
+      <w:numFmt w:val="lowerLetter"/>
+      <w:lvlText w:val="%8."/>
+      <w:lvlJc w:val="left"/>
+      <w:pPr>
+        <w:ind w:left="6469" w:hanging="360"/>
+      </w:pPr>
+    </w:lvl>
+    <w:lvl w:ilvl="8" w:tplc="FFFFFFFF" w:tentative="1">
+      <w:start w:val="1"/>
+      <w:numFmt w:val="lowerRoman"/>
+      <w:lvlText w:val="%9."/>
+      <w:lvlJc w:val="right"/>
+      <w:pPr>
+        <w:ind w:left="7189" w:hanging="180"/>
+      </w:pPr>
+    </w:lvl>
+  </w:abstractNum>
+  <w:abstractNum w:abstractNumId="3" w15:restartNumberingAfterBreak="0">
     <w:nsid w:val="7A780E0E"/>
     <w:multiLevelType w:val="hybridMultilevel"/>
     <w:tmpl w:val="C5DAD368"/>
@@ -2398,10 +3430,16 @@
     </w:lvl>
   </w:abstractNum>
   <w:num w:numId="1" w16cid:durableId="695615859">
+    <w:abstractNumId w:val="3"/>
+  </w:num>
+  <w:num w:numId="2" w16cid:durableId="599027378">
     <w:abstractNumId w:val="1"/>
   </w:num>
-  <w:num w:numId="2" w16cid:durableId="599027378">
+  <w:num w:numId="3" w16cid:durableId="948661166">
     <w:abstractNumId w:val="0"/>
+  </w:num>
+  <w:num w:numId="4" w16cid:durableId="1034572134">
+    <w:abstractNumId w:val="2"/>
   </w:num>
 </w:numbering>
 </file>
@@ -3021,6 +4059,7 @@
   <w:style w:type="character" w:default="1" w:styleId="DefaultParagraphFont">
     <w:name w:val="Default Paragraph Font"/>
     <w:uiPriority w:val="1"/>
+    <w:semiHidden/>
     <w:unhideWhenUsed/>
   </w:style>
   <w:style w:type="table" w:default="1" w:styleId="TableNormal">
@@ -3381,6 +4420,40 @@
       <w:sz w:val="24"/>
     </w:rPr>
   </w:style>
+  <w:style w:type="paragraph" w:styleId="Footer">
+    <w:name w:val="footer"/>
+    <w:basedOn w:val="Normal"/>
+    <w:link w:val="FooterChar"/>
+    <w:uiPriority w:val="99"/>
+    <w:unhideWhenUsed/>
+    <w:rsid w:val="000E0016"/>
+    <w:pPr>
+      <w:tabs>
+        <w:tab w:val="center" w:pos="4252"/>
+        <w:tab w:val="right" w:pos="8504"/>
+      </w:tabs>
+      <w:spacing w:before="0" w:after="0" w:line="240" w:lineRule="auto"/>
+      <w:ind w:firstLine="0"/>
+      <w:jc w:val="left"/>
+    </w:pPr>
+    <w:rPr>
+      <w:rFonts w:asciiTheme="minorHAnsi" w:hAnsiTheme="minorHAnsi"/>
+      <w:kern w:val="0"/>
+      <w:sz w:val="22"/>
+      <w14:ligatures w14:val="none"/>
+    </w:rPr>
+  </w:style>
+  <w:style w:type="character" w:customStyle="1" w:styleId="FooterChar">
+    <w:name w:val="Footer Char"/>
+    <w:basedOn w:val="DefaultParagraphFont"/>
+    <w:link w:val="Footer"/>
+    <w:uiPriority w:val="99"/>
+    <w:rsid w:val="000E0016"/>
+    <w:rPr>
+      <w:kern w:val="0"/>
+      <w14:ligatures w14:val="none"/>
+    </w:rPr>
+  </w:style>
 </w:styles>
 </file>
 

</xml_diff>